<commit_message>
falta video de lectura al módulo 3
</commit_message>
<xml_diff>
--- a/4_parciales/1_parcial/parcial_1_1.docx
+++ b/4_parciales/1_parcial/parcial_1_1.docx
@@ -30,6 +30,7 @@
       </w:pPr>
       <w:r>
         <w:rPr>
+          <w:noProof/>
           <w:lang w:val="es-ES"/>
         </w:rPr>
         <w:drawing>
@@ -84,6 +85,7 @@
       </w:pPr>
       <w:r>
         <w:rPr>
+          <w:noProof/>
           <w:lang w:val="es-ES"/>
         </w:rPr>
         <w:drawing>
@@ -133,6 +135,7 @@
     <w:p>
       <w:r>
         <w:rPr>
+          <w:noProof/>
           <w:lang w:val="es-ES"/>
         </w:rPr>
         <w:drawing>
@@ -160,6 +163,193 @@
                     <a:xfrm>
                       <a:off x="0" y="0"/>
                       <a:ext cx="5612130" cy="446405"/>
+                    </a:xfrm>
+                    <a:prstGeom prst="rect">
+                      <a:avLst/>
+                    </a:prstGeom>
+                  </pic:spPr>
+                </pic:pic>
+              </a:graphicData>
+            </a:graphic>
+          </wp:inline>
+        </w:drawing>
+      </w:r>
+    </w:p>
+    <w:p/>
+    <w:p>
+      <w:r>
+        <w:drawing>
+          <wp:inline distT="0" distB="0" distL="0" distR="0" wp14:anchorId="07DACE6D" wp14:editId="67FA845E">
+            <wp:extent cx="5612130" cy="564515"/>
+            <wp:effectExtent l="0" t="0" r="7620" b="6985"/>
+            <wp:docPr id="1364060298" name="Imagen 1"/>
+            <wp:cNvGraphicFramePr>
+              <a:graphicFrameLocks xmlns:a="http://schemas.openxmlformats.org/drawingml/2006/main" noChangeAspect="1"/>
+            </wp:cNvGraphicFramePr>
+            <a:graphic xmlns:a="http://schemas.openxmlformats.org/drawingml/2006/main">
+              <a:graphicData uri="http://schemas.openxmlformats.org/drawingml/2006/picture">
+                <pic:pic xmlns:pic="http://schemas.openxmlformats.org/drawingml/2006/picture">
+                  <pic:nvPicPr>
+                    <pic:cNvPr id="1364060298" name=""/>
+                    <pic:cNvPicPr/>
+                  </pic:nvPicPr>
+                  <pic:blipFill>
+                    <a:blip r:embed="rId7"/>
+                    <a:stretch>
+                      <a:fillRect/>
+                    </a:stretch>
+                  </pic:blipFill>
+                  <pic:spPr>
+                    <a:xfrm>
+                      <a:off x="0" y="0"/>
+                      <a:ext cx="5612130" cy="564515"/>
+                    </a:xfrm>
+                    <a:prstGeom prst="rect">
+                      <a:avLst/>
+                    </a:prstGeom>
+                  </pic:spPr>
+                </pic:pic>
+              </a:graphicData>
+            </a:graphic>
+          </wp:inline>
+        </w:drawing>
+      </w:r>
+    </w:p>
+    <w:p>
+      <w:r>
+        <w:t xml:space="preserve">Sobre el módulo 2  </w:t>
+      </w:r>
+    </w:p>
+    <w:p/>
+    <w:p>
+      <w:r>
+        <w:drawing>
+          <wp:inline distT="0" distB="0" distL="0" distR="0" wp14:anchorId="15A822D3" wp14:editId="1386016A">
+            <wp:extent cx="5612130" cy="399415"/>
+            <wp:effectExtent l="0" t="0" r="7620" b="635"/>
+            <wp:docPr id="1530243528" name="Imagen 1"/>
+            <wp:cNvGraphicFramePr>
+              <a:graphicFrameLocks xmlns:a="http://schemas.openxmlformats.org/drawingml/2006/main" noChangeAspect="1"/>
+            </wp:cNvGraphicFramePr>
+            <a:graphic xmlns:a="http://schemas.openxmlformats.org/drawingml/2006/main">
+              <a:graphicData uri="http://schemas.openxmlformats.org/drawingml/2006/picture">
+                <pic:pic xmlns:pic="http://schemas.openxmlformats.org/drawingml/2006/picture">
+                  <pic:nvPicPr>
+                    <pic:cNvPr id="1530243528" name=""/>
+                    <pic:cNvPicPr/>
+                  </pic:nvPicPr>
+                  <pic:blipFill>
+                    <a:blip r:embed="rId8"/>
+                    <a:stretch>
+                      <a:fillRect/>
+                    </a:stretch>
+                  </pic:blipFill>
+                  <pic:spPr>
+                    <a:xfrm>
+                      <a:off x="0" y="0"/>
+                      <a:ext cx="5612130" cy="399415"/>
+                    </a:xfrm>
+                    <a:prstGeom prst="rect">
+                      <a:avLst/>
+                    </a:prstGeom>
+                  </pic:spPr>
+                </pic:pic>
+              </a:graphicData>
+            </a:graphic>
+          </wp:inline>
+        </w:drawing>
+      </w:r>
+    </w:p>
+    <w:p>
+      <w:r>
+        <w:drawing>
+          <wp:inline distT="0" distB="0" distL="0" distR="0" wp14:anchorId="0E3FD3D5" wp14:editId="0178B9C7">
+            <wp:extent cx="5612130" cy="405130"/>
+            <wp:effectExtent l="0" t="0" r="7620" b="0"/>
+            <wp:docPr id="1343322448" name="Imagen 1"/>
+            <wp:cNvGraphicFramePr>
+              <a:graphicFrameLocks xmlns:a="http://schemas.openxmlformats.org/drawingml/2006/main" noChangeAspect="1"/>
+            </wp:cNvGraphicFramePr>
+            <a:graphic xmlns:a="http://schemas.openxmlformats.org/drawingml/2006/main">
+              <a:graphicData uri="http://schemas.openxmlformats.org/drawingml/2006/picture">
+                <pic:pic xmlns:pic="http://schemas.openxmlformats.org/drawingml/2006/picture">
+                  <pic:nvPicPr>
+                    <pic:cNvPr id="1343322448" name=""/>
+                    <pic:cNvPicPr/>
+                  </pic:nvPicPr>
+                  <pic:blipFill>
+                    <a:blip r:embed="rId9"/>
+                    <a:stretch>
+                      <a:fillRect/>
+                    </a:stretch>
+                  </pic:blipFill>
+                  <pic:spPr>
+                    <a:xfrm>
+                      <a:off x="0" y="0"/>
+                      <a:ext cx="5612130" cy="405130"/>
+                    </a:xfrm>
+                    <a:prstGeom prst="rect">
+                      <a:avLst/>
+                    </a:prstGeom>
+                  </pic:spPr>
+                </pic:pic>
+              </a:graphicData>
+            </a:graphic>
+          </wp:inline>
+        </w:drawing>
+      </w:r>
+      <w:r>
+        <w:t xml:space="preserve">  </w:t>
+      </w:r>
+    </w:p>
+    <w:p>
+      <w:pPr>
+        <w:rPr>
+          <w:lang w:val="es-ES"/>
+        </w:rPr>
+      </w:pPr>
+      <w:r>
+        <w:rPr>
+          <w:lang w:val="es-ES"/>
+        </w:rPr>
+        <w:t xml:space="preserve">En el siguiente punto, no demuestre sino  que ejemplifique y verifique: </w:t>
+      </w:r>
+    </w:p>
+    <w:p>
+      <w:pPr>
+        <w:rPr>
+          <w:lang w:val="es-ES"/>
+        </w:rPr>
+      </w:pPr>
+      <w:r>
+        <w:rPr>
+          <w:lang w:val="es-ES"/>
+        </w:rPr>
+        <w:drawing>
+          <wp:inline distT="0" distB="0" distL="0" distR="0" wp14:anchorId="7AAA4715" wp14:editId="3B0A7A96">
+            <wp:extent cx="5612130" cy="2044065"/>
+            <wp:effectExtent l="0" t="0" r="7620" b="0"/>
+            <wp:docPr id="1328589304" name="Imagen 1"/>
+            <wp:cNvGraphicFramePr>
+              <a:graphicFrameLocks xmlns:a="http://schemas.openxmlformats.org/drawingml/2006/main" noChangeAspect="1"/>
+            </wp:cNvGraphicFramePr>
+            <a:graphic xmlns:a="http://schemas.openxmlformats.org/drawingml/2006/main">
+              <a:graphicData uri="http://schemas.openxmlformats.org/drawingml/2006/picture">
+                <pic:pic xmlns:pic="http://schemas.openxmlformats.org/drawingml/2006/picture">
+                  <pic:nvPicPr>
+                    <pic:cNvPr id="1328589304" name=""/>
+                    <pic:cNvPicPr/>
+                  </pic:nvPicPr>
+                  <pic:blipFill>
+                    <a:blip r:embed="rId10"/>
+                    <a:stretch>
+                      <a:fillRect/>
+                    </a:stretch>
+                  </pic:blipFill>
+                  <pic:spPr>
+                    <a:xfrm>
+                      <a:off x="0" y="0"/>
+                      <a:ext cx="5612130" cy="2044065"/>
                     </a:xfrm>
                     <a:prstGeom prst="rect">
                       <a:avLst/>

</xml_diff>

<commit_message>
módulo 4 mejor contextualizado
</commit_message>
<xml_diff>
--- a/4_parciales/1_parcial/parcial_1_1.docx
+++ b/4_parciales/1_parcial/parcial_1_1.docx
@@ -5,11 +5,15 @@
     <w:p>
       <w:pPr>
         <w:rPr>
+          <w:b/>
+          <w:bCs/>
           <w:lang w:val="es-ES"/>
         </w:rPr>
       </w:pPr>
       <w:r>
         <w:rPr>
+          <w:b/>
+          <w:bCs/>
           <w:lang w:val="es-ES"/>
         </w:rPr>
         <w:t xml:space="preserve">Parcial 1_1  </w:t>
@@ -18,14 +22,35 @@
     <w:p>
       <w:pPr>
         <w:rPr>
+          <w:b/>
+          <w:bCs/>
           <w:lang w:val="es-ES"/>
         </w:rPr>
       </w:pPr>
       <w:r>
         <w:rPr>
+          <w:b/>
+          <w:bCs/>
           <w:lang w:val="es-ES"/>
         </w:rPr>
         <w:t xml:space="preserve">Sobre el módulo 1: Espacios Vectoriales. </w:t>
+      </w:r>
+    </w:p>
+    <w:p>
+      <w:pPr>
+        <w:rPr>
+          <w:b/>
+          <w:bCs/>
+          <w:lang w:val="es-ES"/>
+        </w:rPr>
+      </w:pPr>
+      <w:r>
+        <w:rPr>
+          <w:b/>
+          <w:bCs/>
+          <w:lang w:val="es-ES"/>
+        </w:rPr>
+        <w:t xml:space="preserve">Nombre del estudiante: </w:t>
       </w:r>
     </w:p>
     <w:p>
@@ -365,6 +390,7 @@
           <w:noProof/>
           <w:lang w:val="es-ES"/>
         </w:rPr>
+        <w:lastRenderedPageBreak/>
         <w:drawing>
           <wp:inline distT="0" distB="0" distL="0" distR="0" wp14:anchorId="7AAA4715" wp14:editId="3B0A7A96">
             <wp:extent cx="5612130" cy="2044065"/>
@@ -447,6 +473,7 @@
         <w:rPr>
           <w:b/>
           <w:bCs/>
+          <w:noProof/>
           <w:lang w:val="es-ES"/>
         </w:rPr>
         <w:drawing>
@@ -498,6 +525,7 @@
         <w:rPr>
           <w:b/>
           <w:bCs/>
+          <w:noProof/>
           <w:lang w:val="es-ES"/>
         </w:rPr>
         <w:drawing>

</xml_diff>